<commit_message>
Syllabus v2.1: 18 weeks, no calendar dates
</commit_message>
<xml_diff>
--- a/Courses/145060/_source/MCCTC_145060_Programming_Syllabus_v2_2026-2027.docx
+++ b/Courses/145060/_source/MCCTC_145060_Programming_Syllabus_v2_2026-2027.docx
@@ -76,7 +76,7 @@
           <w:sz w:val="21"/>
           <w:szCs w:val="21"/>
         </w:rPr>
-        <w:t xml:space="preserve">2026–2027  ·  September 8, 2026 – January 29, 2027</w:t>
+        <w:t xml:space="preserve">18 weeks  ·  Two grading periods of 9 weeks</w:t>
       </w:r>
     </w:p>
     <w:p>
@@ -90,7 +90,7 @@
           <w:sz w:val="21"/>
           <w:szCs w:val="21"/>
         </w:rPr>
-        <w:t xml:space="preserve">Version 2.0  ·  Instructor: Michael Sekol  ·  michael.sekol@mahoningctc.com</w:t>
+        <w:t xml:space="preserve">Version 2.1  ·  Instructor: Michael Sekol  ·  michael.sekol@mahoningctc.com</w:t>
       </w:r>
     </w:p>
     <w:p>
@@ -931,7 +931,7 @@
                 <w:sz w:val="17"/>
                 <w:szCs w:val="17"/>
               </w:rPr>
-              <w:t xml:space="preserve">19 calendar weeks, approximately 18 instructional. Thanksgiving week is two days.</w:t>
+              <w:t xml:space="preserve">18 weeks. Every week is planned as a five-day week, and your instructor adjusts the schedule for each year's calendar.</w:t>
             </w:r>
           </w:p>
         </w:tc>
@@ -989,7 +989,7 @@
                 <w:sz w:val="17"/>
                 <w:szCs w:val="17"/>
               </w:rPr>
-              <w:t xml:space="preserve">September 8 – November 6  ·  9 weeks  ·  Units 0–4</w:t>
+              <w:t xml:space="preserve">Weeks 1–9  ·  Units 0–4</w:t>
             </w:r>
           </w:p>
         </w:tc>
@@ -1045,7 +1045,7 @@
                 <w:sz w:val="17"/>
                 <w:szCs w:val="17"/>
               </w:rPr>
-              <w:t xml:space="preserve">November 9 – January 29  ·  9 weeks plus a partial  ·  Units 5–8</w:t>
+              <w:t xml:space="preserve">Weeks 10–18  ·  Units 5–8</w:t>
             </w:r>
           </w:p>
         </w:tc>
@@ -1351,7 +1351,7 @@
           <w:sz w:val="25"/>
           <w:szCs w:val="25"/>
         </w:rPr>
-        <w:t xml:space="preserve">Assessments and hard dates</w:t>
+        <w:t xml:space="preserve">Assessments and external events</w:t>
       </w:r>
     </w:p>
     <w:tbl>
@@ -1482,7 +1482,7 @@
                 <w:sz w:val="17"/>
                 <w:szCs w:val="17"/>
               </w:rPr>
-              <w:t xml:space="preserve">Week 3 — September 21–25. Fall window closes October 2.</w:t>
+              <w:t xml:space="preserve">Week 3</w:t>
             </w:r>
           </w:p>
         </w:tc>
@@ -1540,7 +1540,7 @@
                 <w:sz w:val="17"/>
                 <w:szCs w:val="17"/>
               </w:rPr>
-              <w:t xml:space="preserve">October 26, 12:00 pm ET</w:t>
+              <w:t xml:space="preserve">Usually Week 8. Your instructor confirms this year's deadline.</w:t>
             </w:r>
           </w:p>
         </w:tc>
@@ -1596,7 +1596,7 @@
                 <w:sz w:val="17"/>
                 <w:szCs w:val="17"/>
               </w:rPr>
-              <w:t xml:space="preserve">November 24</w:t>
+              <w:t xml:space="preserve">Usually right after Week 11. Your instructor confirms the date.</w:t>
             </w:r>
           </w:p>
         </w:tc>
@@ -1654,7 +1654,7 @@
                 <w:sz w:val="17"/>
                 <w:szCs w:val="17"/>
               </w:rPr>
-              <w:t xml:space="preserve">December 7–9</w:t>
+              <w:t xml:space="preserve">Usually Week 13, the competition week</w:t>
             </w:r>
           </w:p>
         </w:tc>
@@ -1710,7 +1710,7 @@
                 <w:sz w:val="17"/>
                 <w:szCs w:val="17"/>
               </w:rPr>
-              <w:t xml:space="preserve">December 11</w:t>
+              <w:t xml:space="preserve">Usually Week 13, the competition week</w:t>
             </w:r>
           </w:p>
         </w:tc>
@@ -1768,7 +1768,7 @@
                 <w:sz w:val="17"/>
                 <w:szCs w:val="17"/>
               </w:rPr>
-              <w:t xml:space="preserve">Week 19 — January 25–29</w:t>
+              <w:t xml:space="preserve">Week 18</w:t>
             </w:r>
           </w:p>
         </w:tc>
@@ -3846,7 +3846,7 @@
                 <w:sz w:val="16"/>
                 <w:szCs w:val="16"/>
               </w:rPr>
-              <w:t xml:space="preserve">DATES  </w:t>
+              <w:t xml:space="preserve">GRADING PERIOD  </w:t>
             </w:r>
             <w:r>
               <w:rPr>
@@ -3855,7 +3855,7 @@
                 <w:sz w:val="18"/>
                 <w:szCs w:val="18"/>
               </w:rPr>
-              <w:t xml:space="preserve">Sept 8 – Sept 18</w:t>
+              <w:t xml:space="preserve">1</w:t>
             </w:r>
           </w:p>
         </w:tc>
@@ -4245,7 +4245,7 @@
                 <w:sz w:val="16"/>
                 <w:szCs w:val="16"/>
               </w:rPr>
-              <w:t xml:space="preserve">DATES  </w:t>
+              <w:t xml:space="preserve">GRADING PERIOD  </w:t>
             </w:r>
             <w:r>
               <w:rPr>
@@ -4254,7 +4254,7 @@
                 <w:sz w:val="18"/>
                 <w:szCs w:val="18"/>
               </w:rPr>
-              <w:t xml:space="preserve">Sept 16 – Oct 2</w:t>
+              <w:t xml:space="preserve">1</w:t>
             </w:r>
           </w:p>
         </w:tc>
@@ -4606,7 +4606,7 @@
                 <w:sz w:val="16"/>
                 <w:szCs w:val="16"/>
               </w:rPr>
-              <w:t xml:space="preserve">DATES  </w:t>
+              <w:t xml:space="preserve">GRADING PERIOD  </w:t>
             </w:r>
             <w:r>
               <w:rPr>
@@ -4615,7 +4615,7 @@
                 <w:sz w:val="18"/>
                 <w:szCs w:val="18"/>
               </w:rPr>
-              <w:t xml:space="preserve">Sept 28 – Oct 16</w:t>
+              <w:t xml:space="preserve">1</w:t>
             </w:r>
           </w:p>
         </w:tc>
@@ -4967,7 +4967,7 @@
                 <w:sz w:val="16"/>
                 <w:szCs w:val="16"/>
               </w:rPr>
-              <w:t xml:space="preserve">DATES  </w:t>
+              <w:t xml:space="preserve">GRADING PERIOD  </w:t>
             </w:r>
             <w:r>
               <w:rPr>
@@ -4976,7 +4976,7 @@
                 <w:sz w:val="18"/>
                 <w:szCs w:val="18"/>
               </w:rPr>
-              <w:t xml:space="preserve">Oct 12 – Oct 30</w:t>
+              <w:t xml:space="preserve">1</w:t>
             </w:r>
           </w:p>
         </w:tc>
@@ -5169,7 +5169,7 @@
           <w:sz w:val="20"/>
           <w:szCs w:val="20"/>
         </w:rPr>
-        <w:t xml:space="preserve">CONGRESSIONAL APP CHALLENGE submission — October 26</w:t>
+        <w:t xml:space="preserve">CONGRESSIONAL APP CHALLENGE submission, deadline usually in Week 8</w:t>
       </w:r>
     </w:p>
     <w:p>
@@ -5347,7 +5347,7 @@
                 <w:sz w:val="16"/>
                 <w:szCs w:val="16"/>
               </w:rPr>
-              <w:t xml:space="preserve">DATES  </w:t>
+              <w:t xml:space="preserve">GRADING PERIOD  </w:t>
             </w:r>
             <w:r>
               <w:rPr>
@@ -5356,7 +5356,7 @@
                 <w:sz w:val="18"/>
                 <w:szCs w:val="18"/>
               </w:rPr>
-              <w:t xml:space="preserve">Oct 26 – Nov 6</w:t>
+              <w:t xml:space="preserve">1</w:t>
             </w:r>
           </w:p>
         </w:tc>
@@ -5549,7 +5549,7 @@
           <w:sz w:val="20"/>
           <w:szCs w:val="20"/>
         </w:rPr>
-        <w:t xml:space="preserve">GP1 ENDS November 6</w:t>
+        <w:t xml:space="preserve">GP1 ENDS Week 9</w:t>
       </w:r>
     </w:p>
     <w:p>
@@ -5680,7 +5680,7 @@
                 <w:sz w:val="18"/>
                 <w:szCs w:val="18"/>
               </w:rPr>
-              <w:t xml:space="preserve">10–12</w:t>
+              <w:t xml:space="preserve">10–11</w:t>
             </w:r>
           </w:p>
         </w:tc>
@@ -5708,7 +5708,7 @@
                 <w:sz w:val="16"/>
                 <w:szCs w:val="16"/>
               </w:rPr>
-              <w:t xml:space="preserve">DATES  </w:t>
+              <w:t xml:space="preserve">GRADING PERIOD  </w:t>
             </w:r>
             <w:r>
               <w:rPr>
@@ -5717,7 +5717,7 @@
                 <w:sz w:val="18"/>
                 <w:szCs w:val="18"/>
               </w:rPr>
-              <w:t xml:space="preserve">Nov 9 – Nov 24</w:t>
+              <w:t xml:space="preserve">2</w:t>
             </w:r>
           </w:p>
         </w:tc>
@@ -5948,7 +5948,7 @@
           <w:sz w:val="20"/>
           <w:szCs w:val="20"/>
         </w:rPr>
-        <w:t xml:space="preserve">BPA PRE-SUBMISSION November 24</w:t>
+        <w:t xml:space="preserve">BPA PRE-SUBMISSION, usually right after Week 11</w:t>
       </w:r>
     </w:p>
     <w:p>
@@ -6079,7 +6079,7 @@
                 <w:sz w:val="18"/>
                 <w:szCs w:val="18"/>
               </w:rPr>
-              <w:t xml:space="preserve">13–15</w:t>
+              <w:t xml:space="preserve">12–14</w:t>
             </w:r>
           </w:p>
         </w:tc>
@@ -6107,7 +6107,7 @@
                 <w:sz w:val="16"/>
                 <w:szCs w:val="16"/>
               </w:rPr>
-              <w:t xml:space="preserve">DATES  </w:t>
+              <w:t xml:space="preserve">GRADING PERIOD  </w:t>
             </w:r>
             <w:r>
               <w:rPr>
@@ -6116,7 +6116,7 @@
                 <w:sz w:val="18"/>
                 <w:szCs w:val="18"/>
               </w:rPr>
-              <w:t xml:space="preserve">Nov 30 – Dec 18</w:t>
+              <w:t xml:space="preserve">2</w:t>
             </w:r>
           </w:p>
         </w:tc>
@@ -6328,7 +6328,7 @@
           <w:sz w:val="20"/>
           <w:szCs w:val="20"/>
         </w:rPr>
-        <w:t xml:space="preserve">BPA REGIONAL CODING EVENTS December 7–9  ·  PRESENTATIONS December 11</w:t>
+        <w:t xml:space="preserve">BPA REGIONAL CODING EVENTS AND PRESENTATIONS, usually Week 13</w:t>
       </w:r>
     </w:p>
     <w:p>
@@ -6459,7 +6459,7 @@
                 <w:sz w:val="18"/>
                 <w:szCs w:val="18"/>
               </w:rPr>
-              <w:t xml:space="preserve">16–18</w:t>
+              <w:t xml:space="preserve">15–17</w:t>
             </w:r>
           </w:p>
         </w:tc>
@@ -6487,7 +6487,7 @@
                 <w:sz w:val="16"/>
                 <w:szCs w:val="16"/>
               </w:rPr>
-              <w:t xml:space="preserve">DATES  </w:t>
+              <w:t xml:space="preserve">GRADING PERIOD  </w:t>
             </w:r>
             <w:r>
               <w:rPr>
@@ -6496,7 +6496,7 @@
                 <w:sz w:val="18"/>
                 <w:szCs w:val="18"/>
               </w:rPr>
-              <w:t xml:space="preserve">Jan 4 – Jan 22</w:t>
+              <w:t xml:space="preserve">2</w:t>
             </w:r>
           </w:p>
         </w:tc>
@@ -6858,7 +6858,7 @@
                 <w:sz w:val="18"/>
                 <w:szCs w:val="18"/>
               </w:rPr>
-              <w:t xml:space="preserve">19</w:t>
+              <w:t xml:space="preserve">18</w:t>
             </w:r>
           </w:p>
         </w:tc>
@@ -6886,7 +6886,7 @@
                 <w:sz w:val="16"/>
                 <w:szCs w:val="16"/>
               </w:rPr>
-              <w:t xml:space="preserve">DATES  </w:t>
+              <w:t xml:space="preserve">GRADING PERIOD  </w:t>
             </w:r>
             <w:r>
               <w:rPr>
@@ -6895,7 +6895,7 @@
                 <w:sz w:val="18"/>
                 <w:szCs w:val="18"/>
               </w:rPr>
-              <w:t xml:space="preserve">Jan 25 – Jan 29</w:t>
+              <w:t xml:space="preserve">2</w:t>
             </w:r>
           </w:p>
         </w:tc>
@@ -7107,7 +7107,7 @@
           <w:sz w:val="20"/>
           <w:szCs w:val="20"/>
         </w:rPr>
-        <w:t xml:space="preserve">GP2 ENDS January 29</w:t>
+        <w:t xml:space="preserve">GP2 ENDS Week 18</w:t>
       </w:r>
     </w:p>
     <w:p>
@@ -7199,7 +7199,7 @@
           <w:sz w:val="25"/>
           <w:szCs w:val="25"/>
         </w:rPr>
-        <w:t xml:space="preserve">Grading Period 1  ·  September 8 – November 6  ·  9 weeks</w:t>
+        <w:t xml:space="preserve">Grading Period 1  ·  Weeks 1–9</w:t>
       </w:r>
     </w:p>
     <w:tbl>
@@ -7216,9 +7216,8 @@
       </w:tblPr>
       <w:tblGrid>
         <w:gridCol w:w="900"/>
-        <w:gridCol w:w="1900"/>
         <w:gridCol w:w="3200"/>
-        <w:gridCol w:w="3360"/>
+        <w:gridCol w:w="5260"/>
       </w:tblGrid>
       <w:tr>
         <w:trPr>
@@ -7254,34 +7253,6 @@
         </w:tc>
         <w:tc>
           <w:tcPr>
-            <w:tcW w:type="dxa" w:w="1900"/>
-            <w:shd w:fill="1B3A5F" w:color="auto" w:val="clear"/>
-            <w:tcMar>
-              <w:top w:type="dxa" w:w="90"/>
-              <w:left w:type="dxa" w:w="130"/>
-              <w:bottom w:type="dxa" w:w="90"/>
-              <w:right w:type="dxa" w:w="130"/>
-            </w:tcMar>
-          </w:tcPr>
-          <w:p>
-            <w:pPr>
-              <w:spacing w:after="0" w:before="0" w:line="276"/>
-            </w:pPr>
-            <w:r>
-              <w:rPr>
-                <w:rFonts w:ascii="Calibri" w:cs="Calibri" w:eastAsia="Calibri" w:hAnsi="Calibri"/>
-                <w:b/>
-                <w:bCs/>
-                <w:color w:val="FFFFFF"/>
-                <w:sz w:val="17"/>
-                <w:szCs w:val="17"/>
-              </w:rPr>
-              <w:t xml:space="preserve">DATES</w:t>
-            </w:r>
-          </w:p>
-        </w:tc>
-        <w:tc>
-          <w:tcPr>
             <w:tcW w:type="dxa" w:w="3200"/>
             <w:shd w:fill="1B3A5F" w:color="auto" w:val="clear"/>
             <w:tcMar>
@@ -7310,7 +7281,7 @@
         </w:tc>
         <w:tc>
           <w:tcPr>
-            <w:tcW w:type="dxa" w:w="3360"/>
+            <w:tcW w:type="dxa" w:w="5260"/>
             <w:shd w:fill="1B3A5F" w:color="auto" w:val="clear"/>
             <w:tcMar>
               <w:top w:type="dxa" w:w="90"/>
@@ -7367,33 +7338,6 @@
         </w:tc>
         <w:tc>
           <w:tcPr>
-            <w:tcW w:type="dxa" w:w="1900"/>
-            <w:tcMar>
-              <w:top w:type="dxa" w:w="90"/>
-              <w:left w:type="dxa" w:w="130"/>
-              <w:bottom w:type="dxa" w:w="90"/>
-              <w:right w:type="dxa" w:w="130"/>
-            </w:tcMar>
-          </w:tcPr>
-          <w:p>
-            <w:pPr>
-              <w:spacing w:after="0" w:before="0" w:line="276"/>
-            </w:pPr>
-            <w:r>
-              <w:rPr>
-                <w:rFonts w:ascii="Calibri" w:cs="Calibri" w:eastAsia="Calibri" w:hAnsi="Calibri"/>
-                <w:b w:val="false"/>
-                <w:bCs w:val="false"/>
-                <w:color w:val="333333"/>
-                <w:sz w:val="17"/>
-                <w:szCs w:val="17"/>
-              </w:rPr>
-              <w:t xml:space="preserve">Sept 8–11</w:t>
-            </w:r>
-          </w:p>
-        </w:tc>
-        <w:tc>
-          <w:tcPr>
             <w:tcW w:type="dxa" w:w="3200"/>
             <w:tcMar>
               <w:top w:type="dxa" w:w="90"/>
@@ -7421,28 +7365,28 @@
         </w:tc>
         <w:tc>
           <w:tcPr>
-            <w:tcW w:type="dxa" w:w="3360"/>
-            <w:tcMar>
-              <w:top w:type="dxa" w:w="90"/>
-              <w:left w:type="dxa" w:w="130"/>
-              <w:bottom w:type="dxa" w:w="90"/>
-              <w:right w:type="dxa" w:w="130"/>
-            </w:tcMar>
-          </w:tcPr>
-          <w:p>
-            <w:pPr>
-              <w:spacing w:after="0" w:before="0" w:line="276"/>
-            </w:pPr>
-            <w:r>
-              <w:rPr>
-                <w:rFonts w:ascii="Calibri" w:cs="Calibri" w:eastAsia="Calibri" w:hAnsi="Calibri"/>
-                <w:b w:val="false"/>
-                <w:bCs w:val="false"/>
-                <w:color w:val="333333"/>
-                <w:sz w:val="17"/>
-                <w:szCs w:val="17"/>
-              </w:rPr>
-              <w:t xml:space="preserve">First day Sept 8. Setup, SQ-01, Problem Inventory.</w:t>
+            <w:tcW w:type="dxa" w:w="5260"/>
+            <w:tcMar>
+              <w:top w:type="dxa" w:w="90"/>
+              <w:left w:type="dxa" w:w="130"/>
+              <w:bottom w:type="dxa" w:w="90"/>
+              <w:right w:type="dxa" w:w="130"/>
+            </w:tcMar>
+          </w:tcPr>
+          <w:p>
+            <w:pPr>
+              <w:spacing w:after="0" w:before="0" w:line="276"/>
+            </w:pPr>
+            <w:r>
+              <w:rPr>
+                <w:rFonts w:ascii="Calibri" w:cs="Calibri" w:eastAsia="Calibri" w:hAnsi="Calibri"/>
+                <w:b w:val="false"/>
+                <w:bCs w:val="false"/>
+                <w:color w:val="333333"/>
+                <w:sz w:val="17"/>
+                <w:szCs w:val="17"/>
+              </w:rPr>
+              <w:t xml:space="preserve">First week. Setup, SQ-01, Problem Inventory.</w:t>
             </w:r>
           </w:p>
         </w:tc>
@@ -7478,34 +7422,6 @@
         </w:tc>
         <w:tc>
           <w:tcPr>
-            <w:tcW w:type="dxa" w:w="1900"/>
-            <w:shd w:fill="F2F5F9" w:color="auto" w:val="clear"/>
-            <w:tcMar>
-              <w:top w:type="dxa" w:w="90"/>
-              <w:left w:type="dxa" w:w="130"/>
-              <w:bottom w:type="dxa" w:w="90"/>
-              <w:right w:type="dxa" w:w="130"/>
-            </w:tcMar>
-          </w:tcPr>
-          <w:p>
-            <w:pPr>
-              <w:spacing w:after="0" w:before="0" w:line="276"/>
-            </w:pPr>
-            <w:r>
-              <w:rPr>
-                <w:rFonts w:ascii="Calibri" w:cs="Calibri" w:eastAsia="Calibri" w:hAnsi="Calibri"/>
-                <w:b w:val="false"/>
-                <w:bCs w:val="false"/>
-                <w:color w:val="333333"/>
-                <w:sz w:val="17"/>
-                <w:szCs w:val="17"/>
-              </w:rPr>
-              <w:t xml:space="preserve">Sept 14–18</w:t>
-            </w:r>
-          </w:p>
-        </w:tc>
-        <w:tc>
-          <w:tcPr>
             <w:tcW w:type="dxa" w:w="3200"/>
             <w:shd w:fill="F2F5F9" w:color="auto" w:val="clear"/>
             <w:tcMar>
@@ -7534,7 +7450,7 @@
         </w:tc>
         <w:tc>
           <w:tcPr>
-            <w:tcW w:type="dxa" w:w="3360"/>
+            <w:tcW w:type="dxa" w:w="5260"/>
             <w:shd w:fill="F2F5F9" w:color="auto" w:val="clear"/>
             <w:tcMar>
               <w:top w:type="dxa" w:w="90"/>
@@ -7591,33 +7507,6 @@
         </w:tc>
         <w:tc>
           <w:tcPr>
-            <w:tcW w:type="dxa" w:w="1900"/>
-            <w:tcMar>
-              <w:top w:type="dxa" w:w="90"/>
-              <w:left w:type="dxa" w:w="130"/>
-              <w:bottom w:type="dxa" w:w="90"/>
-              <w:right w:type="dxa" w:w="130"/>
-            </w:tcMar>
-          </w:tcPr>
-          <w:p>
-            <w:pPr>
-              <w:spacing w:after="0" w:before="0" w:line="276"/>
-            </w:pPr>
-            <w:r>
-              <w:rPr>
-                <w:rFonts w:ascii="Calibri" w:cs="Calibri" w:eastAsia="Calibri" w:hAnsi="Calibri"/>
-                <w:b w:val="false"/>
-                <w:bCs w:val="false"/>
-                <w:color w:val="333333"/>
-                <w:sz w:val="17"/>
-                <w:szCs w:val="17"/>
-              </w:rPr>
-              <w:t xml:space="preserve">Sept 21–25</w:t>
-            </w:r>
-          </w:p>
-        </w:tc>
-        <w:tc>
-          <w:tcPr>
             <w:tcW w:type="dxa" w:w="3200"/>
             <w:tcMar>
               <w:top w:type="dxa" w:w="90"/>
@@ -7645,28 +7534,28 @@
         </w:tc>
         <w:tc>
           <w:tcPr>
-            <w:tcW w:type="dxa" w:w="3360"/>
-            <w:tcMar>
-              <w:top w:type="dxa" w:w="90"/>
-              <w:left w:type="dxa" w:w="130"/>
-              <w:bottom w:type="dxa" w:w="90"/>
-              <w:right w:type="dxa" w:w="130"/>
-            </w:tcMar>
-          </w:tcPr>
-          <w:p>
-            <w:pPr>
-              <w:spacing w:after="0" w:before="0" w:line="276"/>
-            </w:pPr>
-            <w:r>
-              <w:rPr>
-                <w:rFonts w:ascii="Calibri" w:cs="Calibri" w:eastAsia="Calibri" w:hAnsi="Calibri"/>
-                <w:b w:val="false"/>
-                <w:bCs w:val="false"/>
-                <w:color w:val="333333"/>
-                <w:sz w:val="17"/>
-                <w:szCs w:val="17"/>
-              </w:rPr>
-              <w:t xml:space="preserve">WEBXAM PRETEST. Window closes Oct 2.</w:t>
+            <w:tcW w:type="dxa" w:w="5260"/>
+            <w:tcMar>
+              <w:top w:type="dxa" w:w="90"/>
+              <w:left w:type="dxa" w:w="130"/>
+              <w:bottom w:type="dxa" w:w="90"/>
+              <w:right w:type="dxa" w:w="130"/>
+            </w:tcMar>
+          </w:tcPr>
+          <w:p>
+            <w:pPr>
+              <w:spacing w:after="0" w:before="0" w:line="276"/>
+            </w:pPr>
+            <w:r>
+              <w:rPr>
+                <w:rFonts w:ascii="Calibri" w:cs="Calibri" w:eastAsia="Calibri" w:hAnsi="Calibri"/>
+                <w:b w:val="false"/>
+                <w:bCs w:val="false"/>
+                <w:color w:val="333333"/>
+                <w:sz w:val="17"/>
+                <w:szCs w:val="17"/>
+              </w:rPr>
+              <w:t xml:space="preserve">WEBXAM PRETEST.</w:t>
             </w:r>
           </w:p>
         </w:tc>
@@ -7702,34 +7591,6 @@
         </w:tc>
         <w:tc>
           <w:tcPr>
-            <w:tcW w:type="dxa" w:w="1900"/>
-            <w:shd w:fill="F2F5F9" w:color="auto" w:val="clear"/>
-            <w:tcMar>
-              <w:top w:type="dxa" w:w="90"/>
-              <w:left w:type="dxa" w:w="130"/>
-              <w:bottom w:type="dxa" w:w="90"/>
-              <w:right w:type="dxa" w:w="130"/>
-            </w:tcMar>
-          </w:tcPr>
-          <w:p>
-            <w:pPr>
-              <w:spacing w:after="0" w:before="0" w:line="276"/>
-            </w:pPr>
-            <w:r>
-              <w:rPr>
-                <w:rFonts w:ascii="Calibri" w:cs="Calibri" w:eastAsia="Calibri" w:hAnsi="Calibri"/>
-                <w:b w:val="false"/>
-                <w:bCs w:val="false"/>
-                <w:color w:val="333333"/>
-                <w:sz w:val="17"/>
-                <w:szCs w:val="17"/>
-              </w:rPr>
-              <w:t xml:space="preserve">Sept 28 – Oct 2</w:t>
-            </w:r>
-          </w:p>
-        </w:tc>
-        <w:tc>
-          <w:tcPr>
             <w:tcW w:type="dxa" w:w="3200"/>
             <w:shd w:fill="F2F5F9" w:color="auto" w:val="clear"/>
             <w:tcMar>
@@ -7758,7 +7619,7 @@
         </w:tc>
         <w:tc>
           <w:tcPr>
-            <w:tcW w:type="dxa" w:w="3360"/>
+            <w:tcW w:type="dxa" w:w="5260"/>
             <w:shd w:fill="F2F5F9" w:color="auto" w:val="clear"/>
             <w:tcMar>
               <w:top w:type="dxa" w:w="90"/>
@@ -7815,33 +7676,6 @@
         </w:tc>
         <w:tc>
           <w:tcPr>
-            <w:tcW w:type="dxa" w:w="1900"/>
-            <w:tcMar>
-              <w:top w:type="dxa" w:w="90"/>
-              <w:left w:type="dxa" w:w="130"/>
-              <w:bottom w:type="dxa" w:w="90"/>
-              <w:right w:type="dxa" w:w="130"/>
-            </w:tcMar>
-          </w:tcPr>
-          <w:p>
-            <w:pPr>
-              <w:spacing w:after="0" w:before="0" w:line="276"/>
-            </w:pPr>
-            <w:r>
-              <w:rPr>
-                <w:rFonts w:ascii="Calibri" w:cs="Calibri" w:eastAsia="Calibri" w:hAnsi="Calibri"/>
-                <w:b w:val="false"/>
-                <w:bCs w:val="false"/>
-                <w:color w:val="333333"/>
-                <w:sz w:val="17"/>
-                <w:szCs w:val="17"/>
-              </w:rPr>
-              <w:t xml:space="preserve">Oct 5–9</w:t>
-            </w:r>
-          </w:p>
-        </w:tc>
-        <w:tc>
-          <w:tcPr>
             <w:tcW w:type="dxa" w:w="3200"/>
             <w:tcMar>
               <w:top w:type="dxa" w:w="90"/>
@@ -7869,28 +7703,28 @@
         </w:tc>
         <w:tc>
           <w:tcPr>
-            <w:tcW w:type="dxa" w:w="3360"/>
-            <w:tcMar>
-              <w:top w:type="dxa" w:w="90"/>
-              <w:left w:type="dxa" w:w="130"/>
-              <w:bottom w:type="dxa" w:w="90"/>
-              <w:right w:type="dxa" w:w="130"/>
-            </w:tcMar>
-          </w:tcPr>
-          <w:p>
-            <w:pPr>
-              <w:spacing w:after="0" w:before="0" w:line="276"/>
-            </w:pPr>
-            <w:r>
-              <w:rPr>
-                <w:rFonts w:ascii="Calibri" w:cs="Calibri" w:eastAsia="Calibri" w:hAnsi="Calibri"/>
-                <w:b w:val="false"/>
-                <w:bCs w:val="false"/>
-                <w:color w:val="333333"/>
-                <w:sz w:val="17"/>
-                <w:szCs w:val="17"/>
-              </w:rPr>
-              <w:t xml:space="preserve">Oct 9 NEOEA Day, no classes.</w:t>
+            <w:tcW w:type="dxa" w:w="5260"/>
+            <w:tcMar>
+              <w:top w:type="dxa" w:w="90"/>
+              <w:left w:type="dxa" w:w="130"/>
+              <w:bottom w:type="dxa" w:w="90"/>
+              <w:right w:type="dxa" w:w="130"/>
+            </w:tcMar>
+          </w:tcPr>
+          <w:p>
+            <w:pPr>
+              <w:spacing w:after="0" w:before="0" w:line="276"/>
+            </w:pPr>
+            <w:r>
+              <w:rPr>
+                <w:rFonts w:ascii="Calibri" w:cs="Calibri" w:eastAsia="Calibri" w:hAnsi="Calibri"/>
+                <w:b w:val="false"/>
+                <w:bCs w:val="false"/>
+                <w:color w:val="333333"/>
+                <w:sz w:val="17"/>
+                <w:szCs w:val="17"/>
+              </w:rPr>
+              <w:t xml:space="preserve">Selection and Boolean logic. Decision engine build.</w:t>
             </w:r>
           </w:p>
         </w:tc>
@@ -7926,34 +7760,6 @@
         </w:tc>
         <w:tc>
           <w:tcPr>
-            <w:tcW w:type="dxa" w:w="1900"/>
-            <w:shd w:fill="F2F5F9" w:color="auto" w:val="clear"/>
-            <w:tcMar>
-              <w:top w:type="dxa" w:w="90"/>
-              <w:left w:type="dxa" w:w="130"/>
-              <w:bottom w:type="dxa" w:w="90"/>
-              <w:right w:type="dxa" w:w="130"/>
-            </w:tcMar>
-          </w:tcPr>
-          <w:p>
-            <w:pPr>
-              <w:spacing w:after="0" w:before="0" w:line="276"/>
-            </w:pPr>
-            <w:r>
-              <w:rPr>
-                <w:rFonts w:ascii="Calibri" w:cs="Calibri" w:eastAsia="Calibri" w:hAnsi="Calibri"/>
-                <w:b w:val="false"/>
-                <w:bCs w:val="false"/>
-                <w:color w:val="333333"/>
-                <w:sz w:val="17"/>
-                <w:szCs w:val="17"/>
-              </w:rPr>
-              <w:t xml:space="preserve">Oct 12–16</w:t>
-            </w:r>
-          </w:p>
-        </w:tc>
-        <w:tc>
-          <w:tcPr>
             <w:tcW w:type="dxa" w:w="3200"/>
             <w:shd w:fill="F2F5F9" w:color="auto" w:val="clear"/>
             <w:tcMar>
@@ -7982,7 +7788,7 @@
         </w:tc>
         <w:tc>
           <w:tcPr>
-            <w:tcW w:type="dxa" w:w="3360"/>
+            <w:tcW w:type="dxa" w:w="5260"/>
             <w:shd w:fill="F2F5F9" w:color="auto" w:val="clear"/>
             <w:tcMar>
               <w:top w:type="dxa" w:w="90"/>
@@ -8004,7 +7810,7 @@
                 <w:sz w:val="17"/>
                 <w:szCs w:val="17"/>
               </w:rPr>
-              <w:t xml:space="preserve">Oct 16 Waiver Day, no classes. Problem drop #1. Text adventure opens.</w:t>
+              <w:t xml:space="preserve">Problem drop #1. Text adventure opens.</w:t>
             </w:r>
           </w:p>
         </w:tc>
@@ -8039,33 +7845,6 @@
         </w:tc>
         <w:tc>
           <w:tcPr>
-            <w:tcW w:type="dxa" w:w="1900"/>
-            <w:tcMar>
-              <w:top w:type="dxa" w:w="90"/>
-              <w:left w:type="dxa" w:w="130"/>
-              <w:bottom w:type="dxa" w:w="90"/>
-              <w:right w:type="dxa" w:w="130"/>
-            </w:tcMar>
-          </w:tcPr>
-          <w:p>
-            <w:pPr>
-              <w:spacing w:after="0" w:before="0" w:line="276"/>
-            </w:pPr>
-            <w:r>
-              <w:rPr>
-                <w:rFonts w:ascii="Calibri" w:cs="Calibri" w:eastAsia="Calibri" w:hAnsi="Calibri"/>
-                <w:b w:val="false"/>
-                <w:bCs w:val="false"/>
-                <w:color w:val="333333"/>
-                <w:sz w:val="17"/>
-                <w:szCs w:val="17"/>
-              </w:rPr>
-              <w:t xml:space="preserve">Oct 19–23</w:t>
-            </w:r>
-          </w:p>
-        </w:tc>
-        <w:tc>
-          <w:tcPr>
             <w:tcW w:type="dxa" w:w="3200"/>
             <w:tcMar>
               <w:top w:type="dxa" w:w="90"/>
@@ -8093,7 +7872,7 @@
         </w:tc>
         <w:tc>
           <w:tcPr>
-            <w:tcW w:type="dxa" w:w="3360"/>
+            <w:tcW w:type="dxa" w:w="5260"/>
             <w:tcMar>
               <w:top w:type="dxa" w:w="90"/>
               <w:left w:type="dxa" w:w="130"/>
@@ -8150,34 +7929,6 @@
         </w:tc>
         <w:tc>
           <w:tcPr>
-            <w:tcW w:type="dxa" w:w="1900"/>
-            <w:shd w:fill="F2F5F9" w:color="auto" w:val="clear"/>
-            <w:tcMar>
-              <w:top w:type="dxa" w:w="90"/>
-              <w:left w:type="dxa" w:w="130"/>
-              <w:bottom w:type="dxa" w:w="90"/>
-              <w:right w:type="dxa" w:w="130"/>
-            </w:tcMar>
-          </w:tcPr>
-          <w:p>
-            <w:pPr>
-              <w:spacing w:after="0" w:before="0" w:line="276"/>
-            </w:pPr>
-            <w:r>
-              <w:rPr>
-                <w:rFonts w:ascii="Calibri" w:cs="Calibri" w:eastAsia="Calibri" w:hAnsi="Calibri"/>
-                <w:b w:val="false"/>
-                <w:bCs w:val="false"/>
-                <w:color w:val="333333"/>
-                <w:sz w:val="17"/>
-                <w:szCs w:val="17"/>
-              </w:rPr>
-              <w:t xml:space="preserve">Oct 26–30</w:t>
-            </w:r>
-          </w:p>
-        </w:tc>
-        <w:tc>
-          <w:tcPr>
             <w:tcW w:type="dxa" w:w="3200"/>
             <w:shd w:fill="F2F5F9" w:color="auto" w:val="clear"/>
             <w:tcMar>
@@ -8206,7 +7957,7 @@
         </w:tc>
         <w:tc>
           <w:tcPr>
-            <w:tcW w:type="dxa" w:w="3360"/>
+            <w:tcW w:type="dxa" w:w="5260"/>
             <w:shd w:fill="F2F5F9" w:color="auto" w:val="clear"/>
             <w:tcMar>
               <w:top w:type="dxa" w:w="90"/>
@@ -8228,7 +7979,7 @@
                 <w:sz w:val="17"/>
                 <w:szCs w:val="17"/>
               </w:rPr>
-              <w:t xml:space="preserve">CAC DEADLINE Oct 26. Text adventure v1 due.</w:t>
+              <w:t xml:space="preserve">CAC deadline usually this week. Text adventure v1 due.</w:t>
             </w:r>
           </w:p>
         </w:tc>
@@ -8263,33 +8014,6 @@
         </w:tc>
         <w:tc>
           <w:tcPr>
-            <w:tcW w:type="dxa" w:w="1900"/>
-            <w:tcMar>
-              <w:top w:type="dxa" w:w="90"/>
-              <w:left w:type="dxa" w:w="130"/>
-              <w:bottom w:type="dxa" w:w="90"/>
-              <w:right w:type="dxa" w:w="130"/>
-            </w:tcMar>
-          </w:tcPr>
-          <w:p>
-            <w:pPr>
-              <w:spacing w:after="0" w:before="0" w:line="276"/>
-            </w:pPr>
-            <w:r>
-              <w:rPr>
-                <w:rFonts w:ascii="Calibri" w:cs="Calibri" w:eastAsia="Calibri" w:hAnsi="Calibri"/>
-                <w:b w:val="false"/>
-                <w:bCs w:val="false"/>
-                <w:color w:val="333333"/>
-                <w:sz w:val="17"/>
-                <w:szCs w:val="17"/>
-              </w:rPr>
-              <w:t xml:space="preserve">Nov 2–6</w:t>
-            </w:r>
-          </w:p>
-        </w:tc>
-        <w:tc>
-          <w:tcPr>
             <w:tcW w:type="dxa" w:w="3200"/>
             <w:tcMar>
               <w:top w:type="dxa" w:w="90"/>
@@ -8317,28 +8041,28 @@
         </w:tc>
         <w:tc>
           <w:tcPr>
-            <w:tcW w:type="dxa" w:w="3360"/>
-            <w:tcMar>
-              <w:top w:type="dxa" w:w="90"/>
-              <w:left w:type="dxa" w:w="130"/>
-              <w:bottom w:type="dxa" w:w="90"/>
-              <w:right w:type="dxa" w:w="130"/>
-            </w:tcMar>
-          </w:tcPr>
-          <w:p>
-            <w:pPr>
-              <w:spacing w:after="0" w:before="0" w:line="276"/>
-            </w:pPr>
-            <w:r>
-              <w:rPr>
-                <w:rFonts w:ascii="Calibri" w:cs="Calibri" w:eastAsia="Calibri" w:hAnsi="Calibri"/>
-                <w:b w:val="false"/>
-                <w:bCs w:val="false"/>
-                <w:color w:val="333333"/>
-                <w:sz w:val="17"/>
-                <w:szCs w:val="17"/>
-              </w:rPr>
-              <w:t xml:space="preserve">Text adventure v2 due. GP1 ENDS Nov 6.</w:t>
+            <w:tcW w:type="dxa" w:w="5260"/>
+            <w:tcMar>
+              <w:top w:type="dxa" w:w="90"/>
+              <w:left w:type="dxa" w:w="130"/>
+              <w:bottom w:type="dxa" w:w="90"/>
+              <w:right w:type="dxa" w:w="130"/>
+            </w:tcMar>
+          </w:tcPr>
+          <w:p>
+            <w:pPr>
+              <w:spacing w:after="0" w:before="0" w:line="276"/>
+            </w:pPr>
+            <w:r>
+              <w:rPr>
+                <w:rFonts w:ascii="Calibri" w:cs="Calibri" w:eastAsia="Calibri" w:hAnsi="Calibri"/>
+                <w:b w:val="false"/>
+                <w:bCs w:val="false"/>
+                <w:color w:val="333333"/>
+                <w:sz w:val="17"/>
+                <w:szCs w:val="17"/>
+              </w:rPr>
+              <w:t xml:space="preserve">Text adventure v2 due. GP1 ENDS.</w:t>
             </w:r>
           </w:p>
         </w:tc>
@@ -8370,7 +8094,7 @@
           <w:sz w:val="25"/>
           <w:szCs w:val="25"/>
         </w:rPr>
-        <w:t xml:space="preserve">Grading Period 2  ·  November 9 – January 29</w:t>
+        <w:t xml:space="preserve">Grading Period 2  ·  Weeks 10–18</w:t>
       </w:r>
     </w:p>
     <w:tbl>
@@ -8387,9 +8111,8 @@
       </w:tblPr>
       <w:tblGrid>
         <w:gridCol w:w="900"/>
-        <w:gridCol w:w="1900"/>
         <w:gridCol w:w="3200"/>
-        <w:gridCol w:w="3360"/>
+        <w:gridCol w:w="5260"/>
       </w:tblGrid>
       <w:tr>
         <w:trPr>
@@ -8425,34 +8148,6 @@
         </w:tc>
         <w:tc>
           <w:tcPr>
-            <w:tcW w:type="dxa" w:w="1900"/>
-            <w:shd w:fill="1B3A5F" w:color="auto" w:val="clear"/>
-            <w:tcMar>
-              <w:top w:type="dxa" w:w="90"/>
-              <w:left w:type="dxa" w:w="130"/>
-              <w:bottom w:type="dxa" w:w="90"/>
-              <w:right w:type="dxa" w:w="130"/>
-            </w:tcMar>
-          </w:tcPr>
-          <w:p>
-            <w:pPr>
-              <w:spacing w:after="0" w:before="0" w:line="276"/>
-            </w:pPr>
-            <w:r>
-              <w:rPr>
-                <w:rFonts w:ascii="Calibri" w:cs="Calibri" w:eastAsia="Calibri" w:hAnsi="Calibri"/>
-                <w:b/>
-                <w:bCs/>
-                <w:color w:val="FFFFFF"/>
-                <w:sz w:val="17"/>
-                <w:szCs w:val="17"/>
-              </w:rPr>
-              <w:t xml:space="preserve">DATES</w:t>
-            </w:r>
-          </w:p>
-        </w:tc>
-        <w:tc>
-          <w:tcPr>
             <w:tcW w:type="dxa" w:w="3200"/>
             <w:shd w:fill="1B3A5F" w:color="auto" w:val="clear"/>
             <w:tcMar>
@@ -8481,7 +8176,7 @@
         </w:tc>
         <w:tc>
           <w:tcPr>
-            <w:tcW w:type="dxa" w:w="3360"/>
+            <w:tcW w:type="dxa" w:w="5260"/>
             <w:shd w:fill="1B3A5F" w:color="auto" w:val="clear"/>
             <w:tcMar>
               <w:top w:type="dxa" w:w="90"/>
@@ -8538,33 +8233,6 @@
         </w:tc>
         <w:tc>
           <w:tcPr>
-            <w:tcW w:type="dxa" w:w="1900"/>
-            <w:tcMar>
-              <w:top w:type="dxa" w:w="90"/>
-              <w:left w:type="dxa" w:w="130"/>
-              <w:bottom w:type="dxa" w:w="90"/>
-              <w:right w:type="dxa" w:w="130"/>
-            </w:tcMar>
-          </w:tcPr>
-          <w:p>
-            <w:pPr>
-              <w:spacing w:after="0" w:before="0" w:line="276"/>
-            </w:pPr>
-            <w:r>
-              <w:rPr>
-                <w:rFonts w:ascii="Calibri" w:cs="Calibri" w:eastAsia="Calibri" w:hAnsi="Calibri"/>
-                <w:b w:val="false"/>
-                <w:bCs w:val="false"/>
-                <w:color w:val="333333"/>
-                <w:sz w:val="17"/>
-                <w:szCs w:val="17"/>
-              </w:rPr>
-              <w:t xml:space="preserve">Nov 9–13</w:t>
-            </w:r>
-          </w:p>
-        </w:tc>
-        <w:tc>
-          <w:tcPr>
             <w:tcW w:type="dxa" w:w="3200"/>
             <w:tcMar>
               <w:top w:type="dxa" w:w="90"/>
@@ -8592,28 +8260,28 @@
         </w:tc>
         <w:tc>
           <w:tcPr>
-            <w:tcW w:type="dxa" w:w="3360"/>
-            <w:tcMar>
-              <w:top w:type="dxa" w:w="90"/>
-              <w:left w:type="dxa" w:w="130"/>
-              <w:bottom w:type="dxa" w:w="90"/>
-              <w:right w:type="dxa" w:w="130"/>
-            </w:tcMar>
-          </w:tcPr>
-          <w:p>
-            <w:pPr>
-              <w:spacing w:after="0" w:before="0" w:line="276"/>
-            </w:pPr>
-            <w:r>
-              <w:rPr>
-                <w:rFonts w:ascii="Calibri" w:cs="Calibri" w:eastAsia="Calibri" w:hAnsi="Calibri"/>
-                <w:b w:val="false"/>
-                <w:bCs w:val="false"/>
-                <w:color w:val="333333"/>
-                <w:sz w:val="17"/>
-                <w:szCs w:val="17"/>
-              </w:rPr>
-              <w:t xml:space="preserve">Collections. NASA Space Apps Nov 14–15 (weekend).</w:t>
+            <w:tcW w:type="dxa" w:w="5260"/>
+            <w:tcMar>
+              <w:top w:type="dxa" w:w="90"/>
+              <w:left w:type="dxa" w:w="130"/>
+              <w:bottom w:type="dxa" w:w="90"/>
+              <w:right w:type="dxa" w:w="130"/>
+            </w:tcMar>
+          </w:tcPr>
+          <w:p>
+            <w:pPr>
+              <w:spacing w:after="0" w:before="0" w:line="276"/>
+            </w:pPr>
+            <w:r>
+              <w:rPr>
+                <w:rFonts w:ascii="Calibri" w:cs="Calibri" w:eastAsia="Calibri" w:hAnsi="Calibri"/>
+                <w:b w:val="false"/>
+                <w:bCs w:val="false"/>
+                <w:color w:val="333333"/>
+                <w:sz w:val="17"/>
+                <w:szCs w:val="17"/>
+              </w:rPr>
+              <w:t xml:space="preserve">Collections, JSON, and save and load. NASA Space Apps Challenge weekend usually near here.</w:t>
             </w:r>
           </w:p>
         </w:tc>
@@ -8649,34 +8317,6 @@
         </w:tc>
         <w:tc>
           <w:tcPr>
-            <w:tcW w:type="dxa" w:w="1900"/>
-            <w:shd w:fill="F2F5F9" w:color="auto" w:val="clear"/>
-            <w:tcMar>
-              <w:top w:type="dxa" w:w="90"/>
-              <w:left w:type="dxa" w:w="130"/>
-              <w:bottom w:type="dxa" w:w="90"/>
-              <w:right w:type="dxa" w:w="130"/>
-            </w:tcMar>
-          </w:tcPr>
-          <w:p>
-            <w:pPr>
-              <w:spacing w:after="0" w:before="0" w:line="276"/>
-            </w:pPr>
-            <w:r>
-              <w:rPr>
-                <w:rFonts w:ascii="Calibri" w:cs="Calibri" w:eastAsia="Calibri" w:hAnsi="Calibri"/>
-                <w:b w:val="false"/>
-                <w:bCs w:val="false"/>
-                <w:color w:val="333333"/>
-                <w:sz w:val="17"/>
-                <w:szCs w:val="17"/>
-              </w:rPr>
-              <w:t xml:space="preserve">Nov 16–20</w:t>
-            </w:r>
-          </w:p>
-        </w:tc>
-        <w:tc>
-          <w:tcPr>
             <w:tcW w:type="dxa" w:w="3200"/>
             <w:shd w:fill="F2F5F9" w:color="auto" w:val="clear"/>
             <w:tcMar>
@@ -8699,13 +8339,13 @@
                 <w:sz w:val="17"/>
                 <w:szCs w:val="17"/>
               </w:rPr>
-              <w:t xml:space="preserve">Unit 5</w:t>
-            </w:r>
-          </w:p>
-        </w:tc>
-        <w:tc>
-          <w:tcPr>
-            <w:tcW w:type="dxa" w:w="3360"/>
+              <w:t xml:space="preserve">Unit 5 close</w:t>
+            </w:r>
+          </w:p>
+        </w:tc>
+        <w:tc>
+          <w:tcPr>
+            <w:tcW w:type="dxa" w:w="5260"/>
             <w:shd w:fill="F2F5F9" w:color="auto" w:val="clear"/>
             <w:tcMar>
               <w:top w:type="dxa" w:w="90"/>
@@ -8727,7 +8367,7 @@
                 <w:sz w:val="17"/>
                 <w:szCs w:val="17"/>
               </w:rPr>
-              <w:t xml:space="preserve">Files, CSV, JSON, scraping. Nov 19 conferences.</w:t>
+              <w:t xml:space="preserve">Files, CSV, scraping. Unit 5 quiz. Text adventure v3 and data pipeline due. BPA pre-submission usually follows.</w:t>
             </w:r>
           </w:p>
         </w:tc>
@@ -8762,33 +8402,6 @@
         </w:tc>
         <w:tc>
           <w:tcPr>
-            <w:tcW w:type="dxa" w:w="1900"/>
-            <w:tcMar>
-              <w:top w:type="dxa" w:w="90"/>
-              <w:left w:type="dxa" w:w="130"/>
-              <w:bottom w:type="dxa" w:w="90"/>
-              <w:right w:type="dxa" w:w="130"/>
-            </w:tcMar>
-          </w:tcPr>
-          <w:p>
-            <w:pPr>
-              <w:spacing w:after="0" w:before="0" w:line="276"/>
-            </w:pPr>
-            <w:r>
-              <w:rPr>
-                <w:rFonts w:ascii="Calibri" w:cs="Calibri" w:eastAsia="Calibri" w:hAnsi="Calibri"/>
-                <w:b w:val="false"/>
-                <w:bCs w:val="false"/>
-                <w:color w:val="333333"/>
-                <w:sz w:val="17"/>
-                <w:szCs w:val="17"/>
-              </w:rPr>
-              <w:t xml:space="preserve">Nov 23–24</w:t>
-            </w:r>
-          </w:p>
-        </w:tc>
-        <w:tc>
-          <w:tcPr>
             <w:tcW w:type="dxa" w:w="3200"/>
             <w:tcMar>
               <w:top w:type="dxa" w:w="90"/>
@@ -8810,34 +8423,34 @@
                 <w:sz w:val="17"/>
                 <w:szCs w:val="17"/>
               </w:rPr>
-              <w:t xml:space="preserve">Unit 5 close</w:t>
-            </w:r>
-          </w:p>
-        </w:tc>
-        <w:tc>
-          <w:tcPr>
-            <w:tcW w:type="dxa" w:w="3360"/>
-            <w:tcMar>
-              <w:top w:type="dxa" w:w="90"/>
-              <w:left w:type="dxa" w:w="130"/>
-              <w:bottom w:type="dxa" w:w="90"/>
-              <w:right w:type="dxa" w:w="130"/>
-            </w:tcMar>
-          </w:tcPr>
-          <w:p>
-            <w:pPr>
-              <w:spacing w:after="0" w:before="0" w:line="276"/>
-            </w:pPr>
-            <w:r>
-              <w:rPr>
-                <w:rFonts w:ascii="Calibri" w:cs="Calibri" w:eastAsia="Calibri" w:hAnsi="Calibri"/>
-                <w:b w:val="false"/>
-                <w:bCs w:val="false"/>
-                <w:color w:val="333333"/>
-                <w:sz w:val="17"/>
-                <w:szCs w:val="17"/>
-              </w:rPr>
-              <w:t xml:space="preserve">BPA PRE-SUBMISSION Nov 24. Break Nov 25–27. Two-day week.</w:t>
+              <w:t xml:space="preserve">Unit 6</w:t>
+            </w:r>
+          </w:p>
+        </w:tc>
+        <w:tc>
+          <w:tcPr>
+            <w:tcW w:type="dxa" w:w="5260"/>
+            <w:tcMar>
+              <w:top w:type="dxa" w:w="90"/>
+              <w:left w:type="dxa" w:w="130"/>
+              <w:bottom w:type="dxa" w:w="90"/>
+              <w:right w:type="dxa" w:w="130"/>
+            </w:tcMar>
+          </w:tcPr>
+          <w:p>
+            <w:pPr>
+              <w:spacing w:after="0" w:before="0" w:line="276"/>
+            </w:pPr>
+            <w:r>
+              <w:rPr>
+                <w:rFonts w:ascii="Calibri" w:cs="Calibri" w:eastAsia="Calibri" w:hAnsi="Calibri"/>
+                <w:b w:val="false"/>
+                <w:bCs w:val="false"/>
+                <w:color w:val="333333"/>
+                <w:sz w:val="17"/>
+                <w:szCs w:val="17"/>
+              </w:rPr>
+              <w:t xml:space="preserve">Team sprint opens. DMAIC Define and Measure.</w:t>
             </w:r>
           </w:p>
         </w:tc>
@@ -8873,34 +8486,6 @@
         </w:tc>
         <w:tc>
           <w:tcPr>
-            <w:tcW w:type="dxa" w:w="1900"/>
-            <w:shd w:fill="F2F5F9" w:color="auto" w:val="clear"/>
-            <w:tcMar>
-              <w:top w:type="dxa" w:w="90"/>
-              <w:left w:type="dxa" w:w="130"/>
-              <w:bottom w:type="dxa" w:w="90"/>
-              <w:right w:type="dxa" w:w="130"/>
-            </w:tcMar>
-          </w:tcPr>
-          <w:p>
-            <w:pPr>
-              <w:spacing w:after="0" w:before="0" w:line="276"/>
-            </w:pPr>
-            <w:r>
-              <w:rPr>
-                <w:rFonts w:ascii="Calibri" w:cs="Calibri" w:eastAsia="Calibri" w:hAnsi="Calibri"/>
-                <w:b w:val="false"/>
-                <w:bCs w:val="false"/>
-                <w:color w:val="333333"/>
-                <w:sz w:val="17"/>
-                <w:szCs w:val="17"/>
-              </w:rPr>
-              <w:t xml:space="preserve">Nov 30 – Dec 4</w:t>
-            </w:r>
-          </w:p>
-        </w:tc>
-        <w:tc>
-          <w:tcPr>
             <w:tcW w:type="dxa" w:w="3200"/>
             <w:shd w:fill="F2F5F9" w:color="auto" w:val="clear"/>
             <w:tcMar>
@@ -8929,7 +8514,7 @@
         </w:tc>
         <w:tc>
           <w:tcPr>
-            <w:tcW w:type="dxa" w:w="3360"/>
+            <w:tcW w:type="dxa" w:w="5260"/>
             <w:shd w:fill="F2F5F9" w:color="auto" w:val="clear"/>
             <w:tcMar>
               <w:top w:type="dxa" w:w="90"/>
@@ -8951,7 +8536,7 @@
                 <w:sz w:val="17"/>
                 <w:szCs w:val="17"/>
               </w:rPr>
-              <w:t xml:space="preserve">Team sprint opens. DMAIC Define and Measure.</w:t>
+              <w:t xml:space="preserve">BPA REGIONAL, usually this week. Competition week: sub plans, no new instruction.</w:t>
             </w:r>
           </w:p>
         </w:tc>
@@ -8986,33 +8571,6 @@
         </w:tc>
         <w:tc>
           <w:tcPr>
-            <w:tcW w:type="dxa" w:w="1900"/>
-            <w:tcMar>
-              <w:top w:type="dxa" w:w="90"/>
-              <w:left w:type="dxa" w:w="130"/>
-              <w:bottom w:type="dxa" w:w="90"/>
-              <w:right w:type="dxa" w:w="130"/>
-            </w:tcMar>
-          </w:tcPr>
-          <w:p>
-            <w:pPr>
-              <w:spacing w:after="0" w:before="0" w:line="276"/>
-            </w:pPr>
-            <w:r>
-              <w:rPr>
-                <w:rFonts w:ascii="Calibri" w:cs="Calibri" w:eastAsia="Calibri" w:hAnsi="Calibri"/>
-                <w:b w:val="false"/>
-                <w:bCs w:val="false"/>
-                <w:color w:val="333333"/>
-                <w:sz w:val="17"/>
-                <w:szCs w:val="17"/>
-              </w:rPr>
-              <w:t xml:space="preserve">Dec 7–11</w:t>
-            </w:r>
-          </w:p>
-        </w:tc>
-        <w:tc>
-          <w:tcPr>
             <w:tcW w:type="dxa" w:w="3200"/>
             <w:tcMar>
               <w:top w:type="dxa" w:w="90"/>
@@ -9034,34 +8592,34 @@
                 <w:sz w:val="17"/>
                 <w:szCs w:val="17"/>
               </w:rPr>
-              <w:t xml:space="preserve">Unit 6</w:t>
-            </w:r>
-          </w:p>
-        </w:tc>
-        <w:tc>
-          <w:tcPr>
-            <w:tcW w:type="dxa" w:w="3360"/>
-            <w:tcMar>
-              <w:top w:type="dxa" w:w="90"/>
-              <w:left w:type="dxa" w:w="130"/>
-              <w:bottom w:type="dxa" w:w="90"/>
-              <w:right w:type="dxa" w:w="130"/>
-            </w:tcMar>
-          </w:tcPr>
-          <w:p>
-            <w:pPr>
-              <w:spacing w:after="0" w:before="0" w:line="276"/>
-            </w:pPr>
-            <w:r>
-              <w:rPr>
-                <w:rFonts w:ascii="Calibri" w:cs="Calibri" w:eastAsia="Calibri" w:hAnsi="Calibri"/>
-                <w:b w:val="false"/>
-                <w:bCs w:val="false"/>
-                <w:color w:val="333333"/>
-                <w:sz w:val="17"/>
-                <w:szCs w:val="17"/>
-              </w:rPr>
-              <w:t xml:space="preserve">BPA REGIONAL CODING Dec 7–9. PRESENTATIONS Dec 11.</w:t>
+              <w:t xml:space="preserve">Unit 6 close</w:t>
+            </w:r>
+          </w:p>
+        </w:tc>
+        <w:tc>
+          <w:tcPr>
+            <w:tcW w:type="dxa" w:w="5260"/>
+            <w:tcMar>
+              <w:top w:type="dxa" w:w="90"/>
+              <w:left w:type="dxa" w:w="130"/>
+              <w:bottom w:type="dxa" w:w="90"/>
+              <w:right w:type="dxa" w:w="130"/>
+            </w:tcMar>
+          </w:tcPr>
+          <w:p>
+            <w:pPr>
+              <w:spacing w:after="0" w:before="0" w:line="276"/>
+            </w:pPr>
+            <w:r>
+              <w:rPr>
+                <w:rFonts w:ascii="Calibri" w:cs="Calibri" w:eastAsia="Calibri" w:hAnsi="Calibri"/>
+                <w:b w:val="false"/>
+                <w:bCs w:val="false"/>
+                <w:color w:val="333333"/>
+                <w:sz w:val="17"/>
+                <w:szCs w:val="17"/>
+              </w:rPr>
+              <w:t xml:space="preserve">Retrospective.</w:t>
             </w:r>
           </w:p>
         </w:tc>
@@ -9097,34 +8655,6 @@
         </w:tc>
         <w:tc>
           <w:tcPr>
-            <w:tcW w:type="dxa" w:w="1900"/>
-            <w:shd w:fill="F2F5F9" w:color="auto" w:val="clear"/>
-            <w:tcMar>
-              <w:top w:type="dxa" w:w="90"/>
-              <w:left w:type="dxa" w:w="130"/>
-              <w:bottom w:type="dxa" w:w="90"/>
-              <w:right w:type="dxa" w:w="130"/>
-            </w:tcMar>
-          </w:tcPr>
-          <w:p>
-            <w:pPr>
-              <w:spacing w:after="0" w:before="0" w:line="276"/>
-            </w:pPr>
-            <w:r>
-              <w:rPr>
-                <w:rFonts w:ascii="Calibri" w:cs="Calibri" w:eastAsia="Calibri" w:hAnsi="Calibri"/>
-                <w:b w:val="false"/>
-                <w:bCs w:val="false"/>
-                <w:color w:val="333333"/>
-                <w:sz w:val="17"/>
-                <w:szCs w:val="17"/>
-              </w:rPr>
-              <w:t xml:space="preserve">Dec 14–18</w:t>
-            </w:r>
-          </w:p>
-        </w:tc>
-        <w:tc>
-          <w:tcPr>
             <w:tcW w:type="dxa" w:w="3200"/>
             <w:shd w:fill="F2F5F9" w:color="auto" w:val="clear"/>
             <w:tcMar>
@@ -9147,13 +8677,13 @@
                 <w:sz w:val="17"/>
                 <w:szCs w:val="17"/>
               </w:rPr>
-              <w:t xml:space="preserve">Unit 6 close</w:t>
-            </w:r>
-          </w:p>
-        </w:tc>
-        <w:tc>
-          <w:tcPr>
-            <w:tcW w:type="dxa" w:w="3360"/>
+              <w:t xml:space="preserve">Unit 7</w:t>
+            </w:r>
+          </w:p>
+        </w:tc>
+        <w:tc>
+          <w:tcPr>
+            <w:tcW w:type="dxa" w:w="5260"/>
             <w:shd w:fill="F2F5F9" w:color="auto" w:val="clear"/>
             <w:tcMar>
               <w:top w:type="dxa" w:w="90"/>
@@ -9175,7 +8705,7 @@
                 <w:sz w:val="17"/>
                 <w:szCs w:val="17"/>
               </w:rPr>
-              <w:t xml:space="preserve">Retrospective. Banquet Dec 17. Break begins Dec 21.</w:t>
+              <w:t xml:space="preserve">Classes and objects.</w:t>
             </w:r>
           </w:p>
         </w:tc>
@@ -9210,33 +8740,6 @@
         </w:tc>
         <w:tc>
           <w:tcPr>
-            <w:tcW w:type="dxa" w:w="1900"/>
-            <w:tcMar>
-              <w:top w:type="dxa" w:w="90"/>
-              <w:left w:type="dxa" w:w="130"/>
-              <w:bottom w:type="dxa" w:w="90"/>
-              <w:right w:type="dxa" w:w="130"/>
-            </w:tcMar>
-          </w:tcPr>
-          <w:p>
-            <w:pPr>
-              <w:spacing w:after="0" w:before="0" w:line="276"/>
-            </w:pPr>
-            <w:r>
-              <w:rPr>
-                <w:rFonts w:ascii="Calibri" w:cs="Calibri" w:eastAsia="Calibri" w:hAnsi="Calibri"/>
-                <w:b w:val="false"/>
-                <w:bCs w:val="false"/>
-                <w:color w:val="333333"/>
-                <w:sz w:val="17"/>
-                <w:szCs w:val="17"/>
-              </w:rPr>
-              <w:t xml:space="preserve">Jan 4–8</w:t>
-            </w:r>
-          </w:p>
-        </w:tc>
-        <w:tc>
-          <w:tcPr>
             <w:tcW w:type="dxa" w:w="3200"/>
             <w:tcMar>
               <w:top w:type="dxa" w:w="90"/>
@@ -9264,28 +8767,28 @@
         </w:tc>
         <w:tc>
           <w:tcPr>
-            <w:tcW w:type="dxa" w:w="3360"/>
-            <w:tcMar>
-              <w:top w:type="dxa" w:w="90"/>
-              <w:left w:type="dxa" w:w="130"/>
-              <w:bottom w:type="dxa" w:w="90"/>
-              <w:right w:type="dxa" w:w="130"/>
-            </w:tcMar>
-          </w:tcPr>
-          <w:p>
-            <w:pPr>
-              <w:spacing w:after="0" w:before="0" w:line="276"/>
-            </w:pPr>
-            <w:r>
-              <w:rPr>
-                <w:rFonts w:ascii="Calibri" w:cs="Calibri" w:eastAsia="Calibri" w:hAnsi="Calibri"/>
-                <w:b w:val="false"/>
-                <w:bCs w:val="false"/>
-                <w:color w:val="333333"/>
-                <w:sz w:val="17"/>
-                <w:szCs w:val="17"/>
-              </w:rPr>
-              <w:t xml:space="preserve">Return. Classes and objects.</w:t>
+            <w:tcW w:type="dxa" w:w="5260"/>
+            <w:tcMar>
+              <w:top w:type="dxa" w:w="90"/>
+              <w:left w:type="dxa" w:w="130"/>
+              <w:bottom w:type="dxa" w:w="90"/>
+              <w:right w:type="dxa" w:w="130"/>
+            </w:tcMar>
+          </w:tcPr>
+          <w:p>
+            <w:pPr>
+              <w:spacing w:after="0" w:before="0" w:line="276"/>
+            </w:pPr>
+            <w:r>
+              <w:rPr>
+                <w:rFonts w:ascii="Calibri" w:cs="Calibri" w:eastAsia="Calibri" w:hAnsi="Calibri"/>
+                <w:b w:val="false"/>
+                <w:bCs w:val="false"/>
+                <w:color w:val="333333"/>
+                <w:sz w:val="17"/>
+                <w:szCs w:val="17"/>
+              </w:rPr>
+              <w:t xml:space="preserve">APIs and local model. Problem drop #4.</w:t>
             </w:r>
           </w:p>
         </w:tc>
@@ -9321,34 +8824,6 @@
         </w:tc>
         <w:tc>
           <w:tcPr>
-            <w:tcW w:type="dxa" w:w="1900"/>
-            <w:shd w:fill="F2F5F9" w:color="auto" w:val="clear"/>
-            <w:tcMar>
-              <w:top w:type="dxa" w:w="90"/>
-              <w:left w:type="dxa" w:w="130"/>
-              <w:bottom w:type="dxa" w:w="90"/>
-              <w:right w:type="dxa" w:w="130"/>
-            </w:tcMar>
-          </w:tcPr>
-          <w:p>
-            <w:pPr>
-              <w:spacing w:after="0" w:before="0" w:line="276"/>
-            </w:pPr>
-            <w:r>
-              <w:rPr>
-                <w:rFonts w:ascii="Calibri" w:cs="Calibri" w:eastAsia="Calibri" w:hAnsi="Calibri"/>
-                <w:b w:val="false"/>
-                <w:bCs w:val="false"/>
-                <w:color w:val="333333"/>
-                <w:sz w:val="17"/>
-                <w:szCs w:val="17"/>
-              </w:rPr>
-              <w:t xml:space="preserve">Jan 11–15</w:t>
-            </w:r>
-          </w:p>
-        </w:tc>
-        <w:tc>
-          <w:tcPr>
             <w:tcW w:type="dxa" w:w="3200"/>
             <w:shd w:fill="F2F5F9" w:color="auto" w:val="clear"/>
             <w:tcMar>
@@ -9377,7 +8852,7 @@
         </w:tc>
         <w:tc>
           <w:tcPr>
-            <w:tcW w:type="dxa" w:w="3360"/>
+            <w:tcW w:type="dxa" w:w="5260"/>
             <w:shd w:fill="F2F5F9" w:color="auto" w:val="clear"/>
             <w:tcMar>
               <w:top w:type="dxa" w:w="90"/>
@@ -9399,7 +8874,7 @@
                 <w:sz w:val="17"/>
                 <w:szCs w:val="17"/>
               </w:rPr>
-              <w:t xml:space="preserve">APIs and local model. Problem drop #4.</w:t>
+              <w:t xml:space="preserve">Secure coding. Unit 7 quiz. WebXam review begins.</w:t>
             </w:r>
           </w:p>
         </w:tc>
@@ -9434,33 +8909,6 @@
         </w:tc>
         <w:tc>
           <w:tcPr>
-            <w:tcW w:type="dxa" w:w="1900"/>
-            <w:tcMar>
-              <w:top w:type="dxa" w:w="90"/>
-              <w:left w:type="dxa" w:w="130"/>
-              <w:bottom w:type="dxa" w:w="90"/>
-              <w:right w:type="dxa" w:w="130"/>
-            </w:tcMar>
-          </w:tcPr>
-          <w:p>
-            <w:pPr>
-              <w:spacing w:after="0" w:before="0" w:line="276"/>
-            </w:pPr>
-            <w:r>
-              <w:rPr>
-                <w:rFonts w:ascii="Calibri" w:cs="Calibri" w:eastAsia="Calibri" w:hAnsi="Calibri"/>
-                <w:b w:val="false"/>
-                <w:bCs w:val="false"/>
-                <w:color w:val="333333"/>
-                <w:sz w:val="17"/>
-                <w:szCs w:val="17"/>
-              </w:rPr>
-              <w:t xml:space="preserve">Jan 18–22</w:t>
-            </w:r>
-          </w:p>
-        </w:tc>
-        <w:tc>
-          <w:tcPr>
             <w:tcW w:type="dxa" w:w="3200"/>
             <w:tcMar>
               <w:top w:type="dxa" w:w="90"/>
@@ -9482,127 +8930,13 @@
                 <w:sz w:val="17"/>
                 <w:szCs w:val="17"/>
               </w:rPr>
-              <w:t xml:space="preserve">Unit 7</w:t>
-            </w:r>
-          </w:p>
-        </w:tc>
-        <w:tc>
-          <w:tcPr>
-            <w:tcW w:type="dxa" w:w="3360"/>
-            <w:tcMar>
-              <w:top w:type="dxa" w:w="90"/>
-              <w:left w:type="dxa" w:w="130"/>
-              <w:bottom w:type="dxa" w:w="90"/>
-              <w:right w:type="dxa" w:w="130"/>
-            </w:tcMar>
-          </w:tcPr>
-          <w:p>
-            <w:pPr>
-              <w:spacing w:after="0" w:before="0" w:line="276"/>
-            </w:pPr>
-            <w:r>
-              <w:rPr>
-                <w:rFonts w:ascii="Calibri" w:cs="Calibri" w:eastAsia="Calibri" w:hAnsi="Calibri"/>
-                <w:b w:val="false"/>
-                <w:bCs w:val="false"/>
-                <w:color w:val="333333"/>
-                <w:sz w:val="17"/>
-                <w:szCs w:val="17"/>
-              </w:rPr>
-              <w:t xml:space="preserve">Jan 18 MLK, no classes. Secure coding. WebXam review begins.</w:t>
-            </w:r>
-          </w:p>
-        </w:tc>
-      </w:tr>
-      <w:tr>
-        <w:tc>
-          <w:tcPr>
-            <w:tcW w:type="dxa" w:w="900"/>
-            <w:shd w:fill="F2F5F9" w:color="auto" w:val="clear"/>
-            <w:tcMar>
-              <w:top w:type="dxa" w:w="90"/>
-              <w:left w:type="dxa" w:w="130"/>
-              <w:bottom w:type="dxa" w:w="90"/>
-              <w:right w:type="dxa" w:w="130"/>
-            </w:tcMar>
-          </w:tcPr>
-          <w:p>
-            <w:pPr>
-              <w:spacing w:after="0" w:before="0" w:line="276"/>
-            </w:pPr>
-            <w:r>
-              <w:rPr>
-                <w:rFonts w:ascii="Calibri" w:cs="Calibri" w:eastAsia="Calibri" w:hAnsi="Calibri"/>
-                <w:b/>
-                <w:bCs/>
-                <w:color w:val="1B3A5F"/>
-                <w:sz w:val="17"/>
-                <w:szCs w:val="17"/>
-              </w:rPr>
-              <w:t xml:space="preserve">19</w:t>
-            </w:r>
-          </w:p>
-        </w:tc>
-        <w:tc>
-          <w:tcPr>
-            <w:tcW w:type="dxa" w:w="1900"/>
-            <w:shd w:fill="F2F5F9" w:color="auto" w:val="clear"/>
-            <w:tcMar>
-              <w:top w:type="dxa" w:w="90"/>
-              <w:left w:type="dxa" w:w="130"/>
-              <w:bottom w:type="dxa" w:w="90"/>
-              <w:right w:type="dxa" w:w="130"/>
-            </w:tcMar>
-          </w:tcPr>
-          <w:p>
-            <w:pPr>
-              <w:spacing w:after="0" w:before="0" w:line="276"/>
-            </w:pPr>
-            <w:r>
-              <w:rPr>
-                <w:rFonts w:ascii="Calibri" w:cs="Calibri" w:eastAsia="Calibri" w:hAnsi="Calibri"/>
-                <w:b w:val="false"/>
-                <w:bCs w:val="false"/>
-                <w:color w:val="333333"/>
-                <w:sz w:val="17"/>
-                <w:szCs w:val="17"/>
-              </w:rPr>
-              <w:t xml:space="preserve">Jan 25–29</w:t>
-            </w:r>
-          </w:p>
-        </w:tc>
-        <w:tc>
-          <w:tcPr>
-            <w:tcW w:type="dxa" w:w="3200"/>
-            <w:shd w:fill="F2F5F9" w:color="auto" w:val="clear"/>
-            <w:tcMar>
-              <w:top w:type="dxa" w:w="90"/>
-              <w:left w:type="dxa" w:w="130"/>
-              <w:bottom w:type="dxa" w:w="90"/>
-              <w:right w:type="dxa" w:w="130"/>
-            </w:tcMar>
-          </w:tcPr>
-          <w:p>
-            <w:pPr>
-              <w:spacing w:after="0" w:before="0" w:line="276"/>
-            </w:pPr>
-            <w:r>
-              <w:rPr>
-                <w:rFonts w:ascii="Calibri" w:cs="Calibri" w:eastAsia="Calibri" w:hAnsi="Calibri"/>
-                <w:b w:val="false"/>
-                <w:bCs w:val="false"/>
-                <w:color w:val="333333"/>
-                <w:sz w:val="17"/>
-                <w:szCs w:val="17"/>
-              </w:rPr>
               <w:t xml:space="preserve">Unit 8</w:t>
             </w:r>
           </w:p>
         </w:tc>
         <w:tc>
           <w:tcPr>
-            <w:tcW w:type="dxa" w:w="3360"/>
-            <w:shd w:fill="F2F5F9" w:color="auto" w:val="clear"/>
+            <w:tcW w:type="dxa" w:w="5260"/>
             <w:tcMar>
               <w:top w:type="dxa" w:w="90"/>
               <w:left w:type="dxa" w:w="130"/>
@@ -9739,7 +9073,7 @@
                 <w:sz w:val="20"/>
                 <w:szCs w:val="20"/>
               </w:rPr>
-              <w:t xml:space="preserve">Version 1 in October is rooms and a game loop. Version 4 in January has a language model writing descriptions. Same project, four times the student.</w:t>
+              <w:t xml:space="preserve">Version 1, in Unit 3, is rooms and a game loop. Version 4, in Unit 7, has a language model writing descriptions. Same project, four times the student.</w:t>
             </w:r>
           </w:p>
         </w:tc>
@@ -11992,7 +11326,7 @@
           <w:sz w:val="16"/>
           <w:szCs w:val="16"/>
         </w:rPr>
-        <w:t xml:space="preserve">Version 2.0  ·  Revised August 2026  ·  Supersedes Version 1.0. Pairs with the Course Prompt Guide, Instructor Guide, Resource Library, and Program Style &amp; Reference Guide.</w:t>
+        <w:t xml:space="preserve">Version 2.1  ·  18-week structure, no calendar dates  ·  Supersedes Version 2.0. Pairs with the Course Prompt Guide, Instructor Guide, Resource Library, and Program Style &amp; Reference Guide.</w:t>
       </w:r>
     </w:p>
     <w:sectPr>
@@ -12061,7 +11395,7 @@
         <w:sz w:val="16"/>
         <w:szCs w:val="16"/>
       </w:rPr>
-      <w:t xml:space="preserve">145060 Programming Syllabus v2  ·  2026–2027  ·  Page </w:t>
+      <w:t xml:space="preserve">145060 Programming Syllabus v2.1  ·  Page </w:t>
     </w:r>
     <w:r>
       <w:rPr>

</xml_diff>